<commit_message>
fix: menghapus template surat
</commit_message>
<xml_diff>
--- a/storage/templates/surat-penawaran.docx
+++ b/storage/templates/surat-penawaran.docx
@@ -397,7 +397,7 @@
     <w:tbl>
       <w:tblPr>
         <w:tblStyle w:val="TableGrid"/>
-        <w:tblW w:w="10343" w:type="dxa"/>
+        <w:tblW w:w="10485" w:type="dxa"/>
         <w:tblInd w:w="-567" w:type="dxa"/>
         <w:tblLayout w:type="fixed"/>
         <w:tblLook w:val="04A0" w:firstRow="1" w:lastRow="0" w:firstColumn="1" w:lastColumn="0" w:noHBand="0" w:noVBand="1"/>
@@ -407,7 +407,7 @@
         <w:gridCol w:w="3544"/>
         <w:gridCol w:w="856"/>
         <w:gridCol w:w="13"/>
-        <w:gridCol w:w="2391"/>
+        <w:gridCol w:w="2533"/>
         <w:gridCol w:w="2835"/>
       </w:tblGrid>
       <w:tr>
@@ -491,7 +491,7 @@
         </w:tc>
         <w:tc>
           <w:tcPr>
-            <w:tcW w:w="2404" w:type="dxa"/>
+            <w:tcW w:w="2546" w:type="dxa"/>
             <w:gridSpan w:val="2"/>
             <w:tcBorders>
               <w:top w:val="single" w:sz="8" w:space="0" w:color="auto"/>
@@ -600,7 +600,7 @@
         </w:tc>
         <w:tc>
           <w:tcPr>
-            <w:tcW w:w="2404" w:type="dxa"/>
+            <w:tcW w:w="2546" w:type="dxa"/>
             <w:gridSpan w:val="2"/>
           </w:tcPr>
           <w:p>
@@ -666,7 +666,7 @@
         </w:tc>
         <w:tc>
           <w:tcPr>
-            <w:tcW w:w="2391" w:type="dxa"/>
+            <w:tcW w:w="2533" w:type="dxa"/>
           </w:tcPr>
           <w:p>
             <w:pPr>
@@ -721,7 +721,7 @@
         </w:tc>
         <w:tc>
           <w:tcPr>
-            <w:tcW w:w="2391" w:type="dxa"/>
+            <w:tcW w:w="2533" w:type="dxa"/>
           </w:tcPr>
           <w:p>
             <w:pPr>
@@ -780,7 +780,7 @@
         </w:tc>
         <w:tc>
           <w:tcPr>
-            <w:tcW w:w="2391" w:type="dxa"/>
+            <w:tcW w:w="2533" w:type="dxa"/>
           </w:tcPr>
           <w:p>
             <w:pPr>
@@ -834,7 +834,7 @@
         </w:tc>
         <w:tc>
           <w:tcPr>
-            <w:tcW w:w="2391" w:type="dxa"/>
+            <w:tcW w:w="2533" w:type="dxa"/>
           </w:tcPr>
           <w:p>
             <w:pPr>
@@ -888,7 +888,7 @@
         </w:tc>
         <w:tc>
           <w:tcPr>
-            <w:tcW w:w="2391" w:type="dxa"/>
+            <w:tcW w:w="2533" w:type="dxa"/>
           </w:tcPr>
           <w:p>
             <w:pPr>
@@ -945,7 +945,7 @@
         </w:tc>
         <w:tc>
           <w:tcPr>
-            <w:tcW w:w="2391" w:type="dxa"/>
+            <w:tcW w:w="2533" w:type="dxa"/>
           </w:tcPr>
           <w:p>
             <w:pPr>
@@ -1009,7 +1009,7 @@
         </w:tc>
         <w:tc>
           <w:tcPr>
-            <w:tcW w:w="2391" w:type="dxa"/>
+            <w:tcW w:w="2533" w:type="dxa"/>
           </w:tcPr>
           <w:p>
             <w:pPr>
@@ -1070,7 +1070,7 @@
         </w:tc>
         <w:tc>
           <w:tcPr>
-            <w:tcW w:w="2391" w:type="dxa"/>
+            <w:tcW w:w="2533" w:type="dxa"/>
           </w:tcPr>
           <w:p>
             <w:pPr>

</xml_diff>